<commit_message>
added The Existence Paradox to portfolio
</commit_message>
<xml_diff>
--- a/assets/images/doc.docx
+++ b/assets/images/doc.docx
@@ -5,10 +5,10 @@
     <w:p>
       <w:r>
         <w:drawing>
-          <wp:inline distT="0" distB="0" distL="0" distR="0" wp14:anchorId="411856F3" wp14:editId="09918B9C">
-            <wp:extent cx="7249537" cy="2791215"/>
-            <wp:effectExtent l="0" t="0" r="0" b="9525"/>
-            <wp:docPr id="1750901343" name="Picture 1" descr="A screen shot of a computer&#10;&#10;AI-generated content may be incorrect."/>
+          <wp:inline distT="0" distB="0" distL="0" distR="0" wp14:anchorId="4E5EA903" wp14:editId="3211C20E">
+            <wp:extent cx="8878539" cy="8402223"/>
+            <wp:effectExtent l="0" t="0" r="0" b="0"/>
+            <wp:docPr id="773121888" name="Picture 1" descr="A screenshot of a computer"/>
             <wp:cNvGraphicFramePr>
               <a:graphicFrameLocks xmlns:a="http://schemas.openxmlformats.org/drawingml/2006/main" noChangeAspect="1"/>
             </wp:cNvGraphicFramePr>
@@ -16,7 +16,7 @@
               <a:graphicData uri="http://schemas.openxmlformats.org/drawingml/2006/picture">
                 <pic:pic xmlns:pic="http://schemas.openxmlformats.org/drawingml/2006/picture">
                   <pic:nvPicPr>
-                    <pic:cNvPr id="1750901343" name="Picture 1" descr="A screen shot of a computer&#10;&#10;AI-generated content may be incorrect."/>
+                    <pic:cNvPr id="773121888" name="Picture 1" descr="A screenshot of a computer"/>
                     <pic:cNvPicPr/>
                   </pic:nvPicPr>
                   <pic:blipFill>
@@ -28,7 +28,7 @@
                   <pic:spPr>
                     <a:xfrm>
                       <a:off x="0" y="0"/>
-                      <a:ext cx="7249537" cy="2791215"/>
+                      <a:ext cx="8878539" cy="8402223"/>
                     </a:xfrm>
                     <a:prstGeom prst="rect">
                       <a:avLst/>
@@ -39,6 +39,53 @@
             </a:graphic>
           </wp:inline>
         </w:drawing>
+      </w:r>
+    </w:p>
+    <w:p>
+      <w:r>
+        <w:drawing>
+          <wp:inline distT="0" distB="0" distL="0" distR="0" wp14:anchorId="4D9F9FA8" wp14:editId="033E0ABF">
+            <wp:extent cx="8726118" cy="8449854"/>
+            <wp:effectExtent l="0" t="0" r="0" b="8890"/>
+            <wp:docPr id="1949953043" name="Picture 1" descr="A screenshot of a cellphone&#10;&#10;AI-generated content may be incorrect."/>
+            <wp:cNvGraphicFramePr>
+              <a:graphicFrameLocks xmlns:a="http://schemas.openxmlformats.org/drawingml/2006/main" noChangeAspect="1"/>
+            </wp:cNvGraphicFramePr>
+            <a:graphic xmlns:a="http://schemas.openxmlformats.org/drawingml/2006/main">
+              <a:graphicData uri="http://schemas.openxmlformats.org/drawingml/2006/picture">
+                <pic:pic xmlns:pic="http://schemas.openxmlformats.org/drawingml/2006/picture">
+                  <pic:nvPicPr>
+                    <pic:cNvPr id="1949953043" name="Picture 1" descr="A screenshot of a cellphone&#10;&#10;AI-generated content may be incorrect."/>
+                    <pic:cNvPicPr/>
+                  </pic:nvPicPr>
+                  <pic:blipFill>
+                    <a:blip r:embed="rId5"/>
+                    <a:stretch>
+                      <a:fillRect/>
+                    </a:stretch>
+                  </pic:blipFill>
+                  <pic:spPr>
+                    <a:xfrm>
+                      <a:off x="0" y="0"/>
+                      <a:ext cx="8726118" cy="8449854"/>
+                    </a:xfrm>
+                    <a:prstGeom prst="rect">
+                      <a:avLst/>
+                    </a:prstGeom>
+                  </pic:spPr>
+                </pic:pic>
+              </a:graphicData>
+            </a:graphic>
+          </wp:inline>
+        </w:drawing>
+      </w:r>
+    </w:p>
+    <w:p>
+      <w:r>
+        <w:br/>
+      </w:r>
+      <w:r>
+        <w:br/>
       </w:r>
     </w:p>
     <w:sectPr>

</xml_diff>

<commit_message>
changed existence-paradox screenshot on portfolio
</commit_message>
<xml_diff>
--- a/assets/images/doc.docx
+++ b/assets/images/doc.docx
@@ -2,84 +2,8 @@
 <file path=word/document.xml><?xml version="1.0" encoding="utf-8"?>
 <w:document xmlns:wpc="http://schemas.microsoft.com/office/word/2010/wordprocessingCanvas" xmlns:cx="http://schemas.microsoft.com/office/drawing/2014/chartex" xmlns:cx1="http://schemas.microsoft.com/office/drawing/2015/9/8/chartex" xmlns:cx2="http://schemas.microsoft.com/office/drawing/2015/10/21/chartex" xmlns:cx3="http://schemas.microsoft.com/office/drawing/2016/5/9/chartex" xmlns:cx4="http://schemas.microsoft.com/office/drawing/2016/5/10/chartex" xmlns:cx5="http://schemas.microsoft.com/office/drawing/2016/5/11/chartex" xmlns:cx6="http://schemas.microsoft.com/office/drawing/2016/5/12/chartex" xmlns:cx7="http://schemas.microsoft.com/office/drawing/2016/5/13/chartex" xmlns:cx8="http://schemas.microsoft.com/office/drawing/2016/5/14/chartex" xmlns:mc="http://schemas.openxmlformats.org/markup-compatibility/2006" xmlns:aink="http://schemas.microsoft.com/office/drawing/2016/ink" xmlns:am3d="http://schemas.microsoft.com/office/drawing/2017/model3d" xmlns:o="urn:schemas-microsoft-com:office:office" xmlns:oel="http://schemas.microsoft.com/office/2019/extlst" xmlns:r="http://schemas.openxmlformats.org/officeDocument/2006/relationships" xmlns:m="http://schemas.openxmlformats.org/officeDocument/2006/math" xmlns:v="urn:schemas-microsoft-com:vml" xmlns:wp14="http://schemas.microsoft.com/office/word/2010/wordprocessingDrawing" xmlns:wp="http://schemas.openxmlformats.org/drawingml/2006/wordprocessingDrawing" xmlns:w10="urn:schemas-microsoft-com:office:word" xmlns:w="http://schemas.openxmlformats.org/wordprocessingml/2006/main" xmlns:w14="http://schemas.microsoft.com/office/word/2010/wordml" xmlns:w15="http://schemas.microsoft.com/office/word/2012/wordml" xmlns:w16cex="http://schemas.microsoft.com/office/word/2018/wordml/cex" xmlns:w16cid="http://schemas.microsoft.com/office/word/2016/wordml/cid" xmlns:w16="http://schemas.microsoft.com/office/word/2018/wordml" xmlns:w16du="http://schemas.microsoft.com/office/word/2023/wordml/word16du" xmlns:w16sdtdh="http://schemas.microsoft.com/office/word/2020/wordml/sdtdatahash" xmlns:w16sdtfl="http://schemas.microsoft.com/office/word/2024/wordml/sdtformatlock" xmlns:w16se="http://schemas.microsoft.com/office/word/2015/wordml/symex" xmlns:wpg="http://schemas.microsoft.com/office/word/2010/wordprocessingGroup" xmlns:wpi="http://schemas.microsoft.com/office/word/2010/wordprocessingInk" xmlns:wne="http://schemas.microsoft.com/office/word/2006/wordml" xmlns:wps="http://schemas.microsoft.com/office/word/2010/wordprocessingShape" mc:Ignorable="w14 w15 w16se w16cid w16 w16cex w16sdtdh w16sdtfl w16du wp14">
   <w:body>
-    <w:p>
-      <w:r>
-        <w:drawing>
-          <wp:inline distT="0" distB="0" distL="0" distR="0" wp14:anchorId="4E5EA903" wp14:editId="3211C20E">
-            <wp:extent cx="8878539" cy="8402223"/>
-            <wp:effectExtent l="0" t="0" r="0" b="0"/>
-            <wp:docPr id="773121888" name="Picture 1" descr="A screenshot of a computer"/>
-            <wp:cNvGraphicFramePr>
-              <a:graphicFrameLocks xmlns:a="http://schemas.openxmlformats.org/drawingml/2006/main" noChangeAspect="1"/>
-            </wp:cNvGraphicFramePr>
-            <a:graphic xmlns:a="http://schemas.openxmlformats.org/drawingml/2006/main">
-              <a:graphicData uri="http://schemas.openxmlformats.org/drawingml/2006/picture">
-                <pic:pic xmlns:pic="http://schemas.openxmlformats.org/drawingml/2006/picture">
-                  <pic:nvPicPr>
-                    <pic:cNvPr id="773121888" name="Picture 1" descr="A screenshot of a computer"/>
-                    <pic:cNvPicPr/>
-                  </pic:nvPicPr>
-                  <pic:blipFill>
-                    <a:blip r:embed="rId4"/>
-                    <a:stretch>
-                      <a:fillRect/>
-                    </a:stretch>
-                  </pic:blipFill>
-                  <pic:spPr>
-                    <a:xfrm>
-                      <a:off x="0" y="0"/>
-                      <a:ext cx="8878539" cy="8402223"/>
-                    </a:xfrm>
-                    <a:prstGeom prst="rect">
-                      <a:avLst/>
-                    </a:prstGeom>
-                  </pic:spPr>
-                </pic:pic>
-              </a:graphicData>
-            </a:graphic>
-          </wp:inline>
-        </w:drawing>
-      </w:r>
-    </w:p>
-    <w:p>
-      <w:r>
-        <w:drawing>
-          <wp:inline distT="0" distB="0" distL="0" distR="0" wp14:anchorId="4D9F9FA8" wp14:editId="033E0ABF">
-            <wp:extent cx="8726118" cy="8449854"/>
-            <wp:effectExtent l="0" t="0" r="0" b="8890"/>
-            <wp:docPr id="1949953043" name="Picture 1" descr="A screenshot of a cellphone&#10;&#10;AI-generated content may be incorrect."/>
-            <wp:cNvGraphicFramePr>
-              <a:graphicFrameLocks xmlns:a="http://schemas.openxmlformats.org/drawingml/2006/main" noChangeAspect="1"/>
-            </wp:cNvGraphicFramePr>
-            <a:graphic xmlns:a="http://schemas.openxmlformats.org/drawingml/2006/main">
-              <a:graphicData uri="http://schemas.openxmlformats.org/drawingml/2006/picture">
-                <pic:pic xmlns:pic="http://schemas.openxmlformats.org/drawingml/2006/picture">
-                  <pic:nvPicPr>
-                    <pic:cNvPr id="1949953043" name="Picture 1" descr="A screenshot of a cellphone&#10;&#10;AI-generated content may be incorrect."/>
-                    <pic:cNvPicPr/>
-                  </pic:nvPicPr>
-                  <pic:blipFill>
-                    <a:blip r:embed="rId5"/>
-                    <a:stretch>
-                      <a:fillRect/>
-                    </a:stretch>
-                  </pic:blipFill>
-                  <pic:spPr>
-                    <a:xfrm>
-                      <a:off x="0" y="0"/>
-                      <a:ext cx="8726118" cy="8449854"/>
-                    </a:xfrm>
-                    <a:prstGeom prst="rect">
-                      <a:avLst/>
-                    </a:prstGeom>
-                  </pic:spPr>
-                </pic:pic>
-              </a:graphicData>
-            </a:graphic>
-          </wp:inline>
-        </w:drawing>
-      </w:r>
-    </w:p>
+    <w:p/>
+    <w:p/>
     <w:p>
       <w:r>
         <w:br/>

</xml_diff>

<commit_message>
added portfolio screenshot and updated scroll, stick, and bird positioning while scrolling
</commit_message>
<xml_diff>
--- a/assets/images/doc.docx
+++ b/assets/images/doc.docx
@@ -4,6 +4,9 @@
   <w:body>
     <w:p>
       <w:r>
+        <w:rPr>
+          <w:noProof/>
+        </w:rPr>
         <w:drawing>
           <wp:inline distT="0" distB="0" distL="0" distR="0" wp14:anchorId="069DA1DD" wp14:editId="77308F8C">
             <wp:extent cx="5943600" cy="2769235"/>
@@ -29,6 +32,87 @@
                     <a:xfrm>
                       <a:off x="0" y="0"/>
                       <a:ext cx="5943600" cy="2769235"/>
+                    </a:xfrm>
+                    <a:prstGeom prst="rect">
+                      <a:avLst/>
+                    </a:prstGeom>
+                  </pic:spPr>
+                </pic:pic>
+              </a:graphicData>
+            </a:graphic>
+          </wp:inline>
+        </w:drawing>
+      </w:r>
+    </w:p>
+    <w:p/>
+    <w:p>
+      <w:r>
+        <w:drawing>
+          <wp:inline distT="0" distB="0" distL="0" distR="0" wp14:anchorId="51398244" wp14:editId="2D37D216">
+            <wp:extent cx="5943600" cy="3667125"/>
+            <wp:effectExtent l="0" t="0" r="0" b="9525"/>
+            <wp:docPr id="683184064" name="Picture 1"/>
+            <wp:cNvGraphicFramePr>
+              <a:graphicFrameLocks xmlns:a="http://schemas.openxmlformats.org/drawingml/2006/main" noChangeAspect="1"/>
+            </wp:cNvGraphicFramePr>
+            <a:graphic xmlns:a="http://schemas.openxmlformats.org/drawingml/2006/main">
+              <a:graphicData uri="http://schemas.openxmlformats.org/drawingml/2006/picture">
+                <pic:pic xmlns:pic="http://schemas.openxmlformats.org/drawingml/2006/picture">
+                  <pic:nvPicPr>
+                    <pic:cNvPr id="683184064" name=""/>
+                    <pic:cNvPicPr/>
+                  </pic:nvPicPr>
+                  <pic:blipFill>
+                    <a:blip r:embed="rId5"/>
+                    <a:stretch>
+                      <a:fillRect/>
+                    </a:stretch>
+                  </pic:blipFill>
+                  <pic:spPr>
+                    <a:xfrm>
+                      <a:off x="0" y="0"/>
+                      <a:ext cx="5943600" cy="3667125"/>
+                    </a:xfrm>
+                    <a:prstGeom prst="rect">
+                      <a:avLst/>
+                    </a:prstGeom>
+                  </pic:spPr>
+                </pic:pic>
+              </a:graphicData>
+            </a:graphic>
+          </wp:inline>
+        </w:drawing>
+      </w:r>
+    </w:p>
+    <w:p/>
+    <w:p>
+      <w:r>
+        <w:lastRenderedPageBreak/>
+        <w:drawing>
+          <wp:inline distT="0" distB="0" distL="0" distR="0" wp14:anchorId="2551CA35" wp14:editId="0763E008">
+            <wp:extent cx="5943600" cy="4726940"/>
+            <wp:effectExtent l="0" t="0" r="0" b="0"/>
+            <wp:docPr id="408666202" name="Picture 1"/>
+            <wp:cNvGraphicFramePr>
+              <a:graphicFrameLocks xmlns:a="http://schemas.openxmlformats.org/drawingml/2006/main" noChangeAspect="1"/>
+            </wp:cNvGraphicFramePr>
+            <a:graphic xmlns:a="http://schemas.openxmlformats.org/drawingml/2006/main">
+              <a:graphicData uri="http://schemas.openxmlformats.org/drawingml/2006/picture">
+                <pic:pic xmlns:pic="http://schemas.openxmlformats.org/drawingml/2006/picture">
+                  <pic:nvPicPr>
+                    <pic:cNvPr id="408666202" name=""/>
+                    <pic:cNvPicPr/>
+                  </pic:nvPicPr>
+                  <pic:blipFill>
+                    <a:blip r:embed="rId6"/>
+                    <a:stretch>
+                      <a:fillRect/>
+                    </a:stretch>
+                  </pic:blipFill>
+                  <pic:spPr>
+                    <a:xfrm>
+                      <a:off x="0" y="0"/>
+                      <a:ext cx="5943600" cy="4726940"/>
                     </a:xfrm>
                     <a:prstGeom prst="rect">
                       <a:avLst/>

</xml_diff>

<commit_message>
updated wormhole modal functionality (and verified 'Directions' link functionality for future implementation)
</commit_message>
<xml_diff>
--- a/assets/images/doc.docx
+++ b/assets/images/doc.docx
@@ -4,14 +4,11 @@
   <w:body>
     <w:p>
       <w:r>
-        <w:rPr>
-          <w:noProof/>
-        </w:rPr>
         <w:drawing>
-          <wp:inline distT="0" distB="0" distL="0" distR="0" wp14:anchorId="069DA1DD" wp14:editId="77308F8C">
-            <wp:extent cx="5943600" cy="2769235"/>
+          <wp:inline distT="0" distB="0" distL="0" distR="0" wp14:anchorId="025E10C8" wp14:editId="5407710C">
+            <wp:extent cx="8229600" cy="2442210"/>
             <wp:effectExtent l="0" t="0" r="0" b="0"/>
-            <wp:docPr id="650698342" name="Picture 1"/>
+            <wp:docPr id="1109158273" name="Picture 1"/>
             <wp:cNvGraphicFramePr>
               <a:graphicFrameLocks xmlns:a="http://schemas.openxmlformats.org/drawingml/2006/main" noChangeAspect="1"/>
             </wp:cNvGraphicFramePr>
@@ -19,7 +16,7 @@
               <a:graphicData uri="http://schemas.openxmlformats.org/drawingml/2006/picture">
                 <pic:pic xmlns:pic="http://schemas.openxmlformats.org/drawingml/2006/picture">
                   <pic:nvPicPr>
-                    <pic:cNvPr id="650698342" name=""/>
+                    <pic:cNvPr id="1109158273" name=""/>
                     <pic:cNvPicPr/>
                   </pic:nvPicPr>
                   <pic:blipFill>
@@ -31,7 +28,7 @@
                   <pic:spPr>
                     <a:xfrm>
                       <a:off x="0" y="0"/>
-                      <a:ext cx="5943600" cy="2769235"/>
+                      <a:ext cx="8229600" cy="2442210"/>
                     </a:xfrm>
                     <a:prstGeom prst="rect">
                       <a:avLst/>
@@ -44,14 +41,14 @@
         </w:drawing>
       </w:r>
     </w:p>
-    <w:p/>
     <w:p>
       <w:r>
+        <w:lastRenderedPageBreak/>
         <w:drawing>
-          <wp:inline distT="0" distB="0" distL="0" distR="0" wp14:anchorId="51398244" wp14:editId="2D37D216">
-            <wp:extent cx="5943600" cy="3667125"/>
-            <wp:effectExtent l="0" t="0" r="0" b="9525"/>
-            <wp:docPr id="683184064" name="Picture 1"/>
+          <wp:inline distT="0" distB="0" distL="0" distR="0" wp14:anchorId="4C0FDF8E" wp14:editId="21341B1D">
+            <wp:extent cx="8229600" cy="5415280"/>
+            <wp:effectExtent l="0" t="0" r="0" b="0"/>
+            <wp:docPr id="574668380" name="Picture 1"/>
             <wp:cNvGraphicFramePr>
               <a:graphicFrameLocks xmlns:a="http://schemas.openxmlformats.org/drawingml/2006/main" noChangeAspect="1"/>
             </wp:cNvGraphicFramePr>
@@ -59,7 +56,7 @@
               <a:graphicData uri="http://schemas.openxmlformats.org/drawingml/2006/picture">
                 <pic:pic xmlns:pic="http://schemas.openxmlformats.org/drawingml/2006/picture">
                   <pic:nvPicPr>
-                    <pic:cNvPr id="683184064" name=""/>
+                    <pic:cNvPr id="574668380" name=""/>
                     <pic:cNvPicPr/>
                   </pic:nvPicPr>
                   <pic:blipFill>
@@ -71,7 +68,47 @@
                   <pic:spPr>
                     <a:xfrm>
                       <a:off x="0" y="0"/>
-                      <a:ext cx="5943600" cy="3667125"/>
+                      <a:ext cx="8229600" cy="5415280"/>
+                    </a:xfrm>
+                    <a:prstGeom prst="rect">
+                      <a:avLst/>
+                    </a:prstGeom>
+                  </pic:spPr>
+                </pic:pic>
+              </a:graphicData>
+            </a:graphic>
+          </wp:inline>
+        </w:drawing>
+      </w:r>
+    </w:p>
+    <w:p>
+      <w:r>
+        <w:lastRenderedPageBreak/>
+        <w:drawing>
+          <wp:inline distT="0" distB="0" distL="0" distR="0" wp14:anchorId="1BA8EBE1" wp14:editId="30FC4F3F">
+            <wp:extent cx="8229600" cy="5473065"/>
+            <wp:effectExtent l="0" t="0" r="0" b="0"/>
+            <wp:docPr id="1473770597" name="Picture 1"/>
+            <wp:cNvGraphicFramePr>
+              <a:graphicFrameLocks xmlns:a="http://schemas.openxmlformats.org/drawingml/2006/main" noChangeAspect="1"/>
+            </wp:cNvGraphicFramePr>
+            <a:graphic xmlns:a="http://schemas.openxmlformats.org/drawingml/2006/main">
+              <a:graphicData uri="http://schemas.openxmlformats.org/drawingml/2006/picture">
+                <pic:pic xmlns:pic="http://schemas.openxmlformats.org/drawingml/2006/picture">
+                  <pic:nvPicPr>
+                    <pic:cNvPr id="1473770597" name=""/>
+                    <pic:cNvPicPr/>
+                  </pic:nvPicPr>
+                  <pic:blipFill>
+                    <a:blip r:embed="rId6"/>
+                    <a:stretch>
+                      <a:fillRect/>
+                    </a:stretch>
+                  </pic:blipFill>
+                  <pic:spPr>
+                    <a:xfrm>
+                      <a:off x="0" y="0"/>
+                      <a:ext cx="8229600" cy="5473065"/>
                     </a:xfrm>
                     <a:prstGeom prst="rect">
                       <a:avLst/>
@@ -89,10 +126,10 @@
       <w:r>
         <w:lastRenderedPageBreak/>
         <w:drawing>
-          <wp:inline distT="0" distB="0" distL="0" distR="0" wp14:anchorId="2551CA35" wp14:editId="0763E008">
-            <wp:extent cx="5943600" cy="4726940"/>
-            <wp:effectExtent l="0" t="0" r="0" b="0"/>
-            <wp:docPr id="408666202" name="Picture 1"/>
+          <wp:inline distT="0" distB="0" distL="0" distR="0" wp14:anchorId="7937E78A" wp14:editId="3C956C60">
+            <wp:extent cx="8229600" cy="4149725"/>
+            <wp:effectExtent l="0" t="0" r="0" b="3175"/>
+            <wp:docPr id="562758624" name="Picture 1"/>
             <wp:cNvGraphicFramePr>
               <a:graphicFrameLocks xmlns:a="http://schemas.openxmlformats.org/drawingml/2006/main" noChangeAspect="1"/>
             </wp:cNvGraphicFramePr>
@@ -100,11 +137,11 @@
               <a:graphicData uri="http://schemas.openxmlformats.org/drawingml/2006/picture">
                 <pic:pic xmlns:pic="http://schemas.openxmlformats.org/drawingml/2006/picture">
                   <pic:nvPicPr>
-                    <pic:cNvPr id="408666202" name=""/>
+                    <pic:cNvPr id="562758624" name=""/>
                     <pic:cNvPicPr/>
                   </pic:nvPicPr>
                   <pic:blipFill>
-                    <a:blip r:embed="rId6"/>
+                    <a:blip r:embed="rId7"/>
                     <a:stretch>
                       <a:fillRect/>
                     </a:stretch>
@@ -112,7 +149,7 @@
                   <pic:spPr>
                     <a:xfrm>
                       <a:off x="0" y="0"/>
-                      <a:ext cx="5943600" cy="4726940"/>
+                      <a:ext cx="8229600" cy="4149725"/>
                     </a:xfrm>
                     <a:prstGeom prst="rect">
                       <a:avLst/>
@@ -125,17 +162,48 @@
         </w:drawing>
       </w:r>
     </w:p>
-    <w:p/>
     <w:p>
       <w:r>
-        <w:br/>
-      </w:r>
-      <w:r>
-        <w:br/>
+        <w:lastRenderedPageBreak/>
+        <w:drawing>
+          <wp:inline distT="0" distB="0" distL="0" distR="0" wp14:anchorId="78A7B1C0" wp14:editId="7F110BC2">
+            <wp:extent cx="8229600" cy="3622675"/>
+            <wp:effectExtent l="0" t="0" r="0" b="0"/>
+            <wp:docPr id="1691775425" name="Picture 1"/>
+            <wp:cNvGraphicFramePr>
+              <a:graphicFrameLocks xmlns:a="http://schemas.openxmlformats.org/drawingml/2006/main" noChangeAspect="1"/>
+            </wp:cNvGraphicFramePr>
+            <a:graphic xmlns:a="http://schemas.openxmlformats.org/drawingml/2006/main">
+              <a:graphicData uri="http://schemas.openxmlformats.org/drawingml/2006/picture">
+                <pic:pic xmlns:pic="http://schemas.openxmlformats.org/drawingml/2006/picture">
+                  <pic:nvPicPr>
+                    <pic:cNvPr id="1691775425" name=""/>
+                    <pic:cNvPicPr/>
+                  </pic:nvPicPr>
+                  <pic:blipFill>
+                    <a:blip r:embed="rId8"/>
+                    <a:stretch>
+                      <a:fillRect/>
+                    </a:stretch>
+                  </pic:blipFill>
+                  <pic:spPr>
+                    <a:xfrm>
+                      <a:off x="0" y="0"/>
+                      <a:ext cx="8229600" cy="3622675"/>
+                    </a:xfrm>
+                    <a:prstGeom prst="rect">
+                      <a:avLst/>
+                    </a:prstGeom>
+                  </pic:spPr>
+                </pic:pic>
+              </a:graphicData>
+            </a:graphic>
+          </wp:inline>
+        </w:drawing>
       </w:r>
     </w:p>
     <w:sectPr>
-      <w:pgSz w:w="12240" w:h="15840"/>
+      <w:pgSz w:w="15840" w:h="12240" w:orient="landscape"/>
       <w:pgMar w:top="1440" w:right="1440" w:bottom="1440" w:left="1440" w:header="720" w:footer="720" w:gutter="0"/>
       <w:cols w:space="720"/>
       <w:docGrid w:linePitch="360"/>

</xml_diff>

<commit_message>
updated flick docs to pdf; fixed missing portfolio screens; minor UI updates
</commit_message>
<xml_diff>
--- a/assets/images/doc.docx
+++ b/assets/images/doc.docx
@@ -4,6 +4,9 @@
   <w:body>
     <w:p>
       <w:r>
+        <w:rPr>
+          <w:noProof/>
+        </w:rPr>
         <w:drawing>
           <wp:inline distT="0" distB="0" distL="0" distR="0" wp14:anchorId="025E10C8" wp14:editId="5407710C">
             <wp:extent cx="8229600" cy="2442210"/>
@@ -43,6 +46,9 @@
     </w:p>
     <w:p>
       <w:r>
+        <w:rPr>
+          <w:noProof/>
+        </w:rPr>
         <w:lastRenderedPageBreak/>
         <w:drawing>
           <wp:inline distT="0" distB="0" distL="0" distR="0" wp14:anchorId="4C0FDF8E" wp14:editId="21341B1D">
@@ -83,6 +89,9 @@
     </w:p>
     <w:p>
       <w:r>
+        <w:rPr>
+          <w:noProof/>
+        </w:rPr>
         <w:lastRenderedPageBreak/>
         <w:drawing>
           <wp:inline distT="0" distB="0" distL="0" distR="0" wp14:anchorId="1BA8EBE1" wp14:editId="30FC4F3F">
@@ -124,6 +133,9 @@
     <w:p/>
     <w:p>
       <w:r>
+        <w:rPr>
+          <w:noProof/>
+        </w:rPr>
         <w:lastRenderedPageBreak/>
         <w:drawing>
           <wp:inline distT="0" distB="0" distL="0" distR="0" wp14:anchorId="7937E78A" wp14:editId="3C956C60">
@@ -164,6 +176,9 @@
     </w:p>
     <w:p>
       <w:r>
+        <w:rPr>
+          <w:noProof/>
+        </w:rPr>
         <w:lastRenderedPageBreak/>
         <w:drawing>
           <wp:inline distT="0" distB="0" distL="0" distR="0" wp14:anchorId="78A7B1C0" wp14:editId="7F110BC2">
@@ -190,6 +205,50 @@
                     <a:xfrm>
                       <a:off x="0" y="0"/>
                       <a:ext cx="8229600" cy="3622675"/>
+                    </a:xfrm>
+                    <a:prstGeom prst="rect">
+                      <a:avLst/>
+                    </a:prstGeom>
+                  </pic:spPr>
+                </pic:pic>
+              </a:graphicData>
+            </a:graphic>
+          </wp:inline>
+        </w:drawing>
+      </w:r>
+      <w:r>
+        <w:br/>
+      </w:r>
+      <w:r>
+        <w:br/>
+      </w:r>
+      <w:r>
+        <w:lastRenderedPageBreak/>
+        <w:drawing>
+          <wp:inline distT="0" distB="0" distL="0" distR="0" wp14:anchorId="7D35DF91" wp14:editId="2B6BED08">
+            <wp:extent cx="8229600" cy="4159250"/>
+            <wp:effectExtent l="0" t="0" r="0" b="0"/>
+            <wp:docPr id="996682374" name="Picture 1"/>
+            <wp:cNvGraphicFramePr>
+              <a:graphicFrameLocks xmlns:a="http://schemas.openxmlformats.org/drawingml/2006/main" noChangeAspect="1"/>
+            </wp:cNvGraphicFramePr>
+            <a:graphic xmlns:a="http://schemas.openxmlformats.org/drawingml/2006/main">
+              <a:graphicData uri="http://schemas.openxmlformats.org/drawingml/2006/picture">
+                <pic:pic xmlns:pic="http://schemas.openxmlformats.org/drawingml/2006/picture">
+                  <pic:nvPicPr>
+                    <pic:cNvPr id="996682374" name=""/>
+                    <pic:cNvPicPr/>
+                  </pic:nvPicPr>
+                  <pic:blipFill>
+                    <a:blip r:embed="rId9"/>
+                    <a:stretch>
+                      <a:fillRect/>
+                    </a:stretch>
+                  </pic:blipFill>
+                  <pic:spPr>
+                    <a:xfrm>
+                      <a:off x="0" y="0"/>
+                      <a:ext cx="8229600" cy="4159250"/>
                     </a:xfrm>
                     <a:prstGeom prst="rect">
                       <a:avLst/>

</xml_diff>

<commit_message>
updated Existence Paradox screens
</commit_message>
<xml_diff>
--- a/assets/images/doc.docx
+++ b/assets/images/doc.docx
@@ -223,6 +223,9 @@
         <w:br/>
       </w:r>
       <w:r>
+        <w:rPr>
+          <w:noProof/>
+        </w:rPr>
         <w:lastRenderedPageBreak/>
         <w:drawing>
           <wp:inline distT="0" distB="0" distL="0" distR="0" wp14:anchorId="7D35DF91" wp14:editId="2B6BED08">
@@ -249,6 +252,86 @@
                     <a:xfrm>
                       <a:off x="0" y="0"/>
                       <a:ext cx="8229600" cy="4159250"/>
+                    </a:xfrm>
+                    <a:prstGeom prst="rect">
+                      <a:avLst/>
+                    </a:prstGeom>
+                  </pic:spPr>
+                </pic:pic>
+              </a:graphicData>
+            </a:graphic>
+          </wp:inline>
+        </w:drawing>
+      </w:r>
+    </w:p>
+    <w:p>
+      <w:r>
+        <w:lastRenderedPageBreak/>
+        <w:drawing>
+          <wp:inline distT="0" distB="0" distL="0" distR="0" wp14:anchorId="2E2861E8" wp14:editId="69AB69FD">
+            <wp:extent cx="8229600" cy="5012690"/>
+            <wp:effectExtent l="0" t="0" r="0" b="0"/>
+            <wp:docPr id="1610228075" name="Picture 1"/>
+            <wp:cNvGraphicFramePr>
+              <a:graphicFrameLocks xmlns:a="http://schemas.openxmlformats.org/drawingml/2006/main" noChangeAspect="1"/>
+            </wp:cNvGraphicFramePr>
+            <a:graphic xmlns:a="http://schemas.openxmlformats.org/drawingml/2006/main">
+              <a:graphicData uri="http://schemas.openxmlformats.org/drawingml/2006/picture">
+                <pic:pic xmlns:pic="http://schemas.openxmlformats.org/drawingml/2006/picture">
+                  <pic:nvPicPr>
+                    <pic:cNvPr id="1610228075" name=""/>
+                    <pic:cNvPicPr/>
+                  </pic:nvPicPr>
+                  <pic:blipFill>
+                    <a:blip r:embed="rId10"/>
+                    <a:stretch>
+                      <a:fillRect/>
+                    </a:stretch>
+                  </pic:blipFill>
+                  <pic:spPr>
+                    <a:xfrm>
+                      <a:off x="0" y="0"/>
+                      <a:ext cx="8229600" cy="5012690"/>
+                    </a:xfrm>
+                    <a:prstGeom prst="rect">
+                      <a:avLst/>
+                    </a:prstGeom>
+                  </pic:spPr>
+                </pic:pic>
+              </a:graphicData>
+            </a:graphic>
+          </wp:inline>
+        </w:drawing>
+      </w:r>
+    </w:p>
+    <w:p>
+      <w:r>
+        <w:lastRenderedPageBreak/>
+        <w:drawing>
+          <wp:inline distT="0" distB="0" distL="0" distR="0" wp14:anchorId="55AB3A59" wp14:editId="418BA6E8">
+            <wp:extent cx="8229600" cy="5614670"/>
+            <wp:effectExtent l="0" t="0" r="0" b="5080"/>
+            <wp:docPr id="1237381020" name="Picture 1"/>
+            <wp:cNvGraphicFramePr>
+              <a:graphicFrameLocks xmlns:a="http://schemas.openxmlformats.org/drawingml/2006/main" noChangeAspect="1"/>
+            </wp:cNvGraphicFramePr>
+            <a:graphic xmlns:a="http://schemas.openxmlformats.org/drawingml/2006/main">
+              <a:graphicData uri="http://schemas.openxmlformats.org/drawingml/2006/picture">
+                <pic:pic xmlns:pic="http://schemas.openxmlformats.org/drawingml/2006/picture">
+                  <pic:nvPicPr>
+                    <pic:cNvPr id="1237381020" name=""/>
+                    <pic:cNvPicPr/>
+                  </pic:nvPicPr>
+                  <pic:blipFill>
+                    <a:blip r:embed="rId11"/>
+                    <a:stretch>
+                      <a:fillRect/>
+                    </a:stretch>
+                  </pic:blipFill>
+                  <pic:spPr>
+                    <a:xfrm>
+                      <a:off x="0" y="0"/>
+                      <a:ext cx="8229600" cy="5614670"/>
                     </a:xfrm>
                     <a:prstGeom prst="rect">
                       <a:avLst/>

</xml_diff>